<commit_message>
fixed: format of output file
</commit_message>
<xml_diff>
--- a/templates/order_air_no_reply.docx
+++ b/templates/order_air_no_reply.docx
@@ -229,23 +229,7 @@
                 <w:rFonts w:ascii="Bookman Old Style" w:eastAsia="Bookman Old Style" w:hAnsi="Bookman Old Style" w:cs="Bookman Old Style"/>
                 <w:b/>
               </w:rPr>
-              <w:t>{{</w:t>
-            </w:r>
-            <w:proofErr w:type="spellStart"/>
-            <w:r>
-              <w:rPr>
-                <w:rFonts w:ascii="Bookman Old Style" w:eastAsia="Bookman Old Style" w:hAnsi="Bookman Old Style" w:cs="Bookman Old Style"/>
-                <w:b/>
-              </w:rPr>
-              <w:t>case_number</w:t>
-            </w:r>
-            <w:proofErr w:type="spellEnd"/>
-            <w:r>
-              <w:rPr>
-                <w:rFonts w:ascii="Bookman Old Style" w:eastAsia="Bookman Old Style" w:hAnsi="Bookman Old Style" w:cs="Bookman Old Style"/>
-                <w:b/>
-              </w:rPr>
-              <w:t>}}</w:t>
+              <w:t>{{case_number}}</w:t>
             </w:r>
           </w:p>
           <w:p>
@@ -287,7 +271,6 @@
               </w:rPr>
               <w:t>{{</w:t>
             </w:r>
-            <w:proofErr w:type="spellStart"/>
             <w:r>
               <w:rPr>
                 <w:rFonts w:ascii="Bookman Old Style" w:eastAsia="Bookman Old Style" w:hAnsi="Bookman Old Style" w:cs="Bookman Old Style"/>
@@ -297,7 +280,6 @@
               </w:rPr>
               <w:t>client_name</w:t>
             </w:r>
-            <w:proofErr w:type="spellEnd"/>
             <w:r>
               <w:rPr>
                 <w:rFonts w:ascii="Bookman Old Style" w:eastAsia="Bookman Old Style" w:hAnsi="Bookman Old Style" w:cs="Bookman Old Style"/>
@@ -407,17 +389,8 @@
           <w:rFonts w:ascii="Bookman Old Style" w:eastAsia="Bookman Old Style" w:hAnsi="Bookman Old Style" w:cs="Bookman Old Style"/>
           <w:b/>
         </w:rPr>
-        <w:t>x----------------------------------------------------</w:t>
-      </w:r>
-      <w:proofErr w:type="spellStart"/>
-      <w:r>
-        <w:rPr>
-          <w:rFonts w:ascii="Bookman Old Style" w:eastAsia="Bookman Old Style" w:hAnsi="Bookman Old Style" w:cs="Bookman Old Style"/>
-          <w:b/>
-        </w:rPr>
-        <w:t>x</w:t>
-      </w:r>
-      <w:proofErr w:type="spellEnd"/>
+        <w:t>x----------------------------------------------------x</w:t>
+      </w:r>
     </w:p>
     <w:p/>
     <w:p>
@@ -462,21 +435,7 @@
         <w:rPr>
           <w:rFonts w:ascii="Bookman Old Style" w:eastAsia="Bookman Old Style" w:hAnsi="Bookman Old Style" w:cs="Bookman Old Style"/>
         </w:rPr>
-        <w:t>For consideration before the Board is the pollution case of Respondent docketed as DENR-PAB CASE NO. NCR {{</w:t>
-      </w:r>
-      <w:proofErr w:type="spellStart"/>
-      <w:r>
-        <w:rPr>
-          <w:rFonts w:ascii="Bookman Old Style" w:eastAsia="Bookman Old Style" w:hAnsi="Bookman Old Style" w:cs="Bookman Old Style"/>
-        </w:rPr>
-        <w:t>case_number</w:t>
-      </w:r>
-      <w:proofErr w:type="spellEnd"/>
-      <w:r>
-        <w:rPr>
-          <w:rFonts w:ascii="Bookman Old Style" w:eastAsia="Bookman Old Style" w:hAnsi="Bookman Old Style" w:cs="Bookman Old Style"/>
-        </w:rPr>
-        <w:t>}}.</w:t>
+        <w:t>For consideration before the Board is the pollution case of Respondent docketed as DENR-PAB CASE NO. NCR {{case_number}}.</w:t>
       </w:r>
     </w:p>
     <w:p>
@@ -499,14 +458,7 @@
         <w:rPr>
           <w:rFonts w:ascii="Bookman Old Style" w:eastAsia="Bookman Old Style" w:hAnsi="Bookman Old Style" w:cs="Bookman Old Style"/>
         </w:rPr>
-        <w:t>Records of the case reveal that, based on the inspection conducted by the technical personnel of this Office on {{</w:t>
-      </w:r>
-      <w:proofErr w:type="spellStart"/>
-      <w:r>
-        <w:rPr>
-          <w:rFonts w:ascii="Bookman Old Style" w:eastAsia="Bookman Old Style" w:hAnsi="Bookman Old Style" w:cs="Bookman Old Style"/>
-        </w:rPr>
-        <w:t>date</w:t>
+        <w:t>Records of the case reveal that, based on the inspection conducted by the technical personnel of this Office on {{date</w:t>
       </w:r>
       <w:r>
         <w:rPr>
@@ -530,14 +482,7 @@
         <w:rPr>
           <w:rFonts w:ascii="Bookman Old Style" w:eastAsia="Bookman Old Style" w:hAnsi="Bookman Old Style" w:cs="Bookman Old Style"/>
         </w:rPr>
-        <w:t>inspection</w:t>
-      </w:r>
-      <w:proofErr w:type="spellEnd"/>
-      <w:r>
-        <w:rPr>
-          <w:rFonts w:ascii="Bookman Old Style" w:eastAsia="Bookman Old Style" w:hAnsi="Bookman Old Style" w:cs="Bookman Old Style"/>
-        </w:rPr>
-        <w:t>}}, Respondent was {{violation</w:t>
+        <w:t>inspection}}, {{violation</w:t>
       </w:r>
       <w:r>
         <w:rPr>
@@ -573,21 +518,7 @@
         <w:rPr>
           <w:rFonts w:ascii="Bookman Old Style" w:eastAsia="Bookman Old Style" w:hAnsi="Bookman Old Style" w:cs="Bookman Old Style"/>
         </w:rPr>
-        <w:t>Consequently, a Notice of Violation (NOV) was issued on {{</w:t>
-      </w:r>
-      <w:proofErr w:type="spellStart"/>
-      <w:r>
-        <w:rPr>
-          <w:rFonts w:ascii="Bookman Old Style" w:eastAsia="Bookman Old Style" w:hAnsi="Bookman Old Style" w:cs="Bookman Old Style"/>
-        </w:rPr>
-        <w:t>date_of_nov</w:t>
-      </w:r>
-      <w:proofErr w:type="spellEnd"/>
-      <w:r>
-        <w:rPr>
-          <w:rFonts w:ascii="Bookman Old Style" w:eastAsia="Bookman Old Style" w:hAnsi="Bookman Old Style" w:cs="Bookman Old Style"/>
-        </w:rPr>
-        <w:t xml:space="preserve">}} and Respondent was given an opportunity to explain why it should not be penalized under the law. </w:t>
+        <w:t xml:space="preserve">Consequently, a Notice of Violation (NOV) was issued on {{date_of_nov}} and Respondent was given an opportunity to explain why it should not be penalized under the law. </w:t>
       </w:r>
     </w:p>
     <w:p>
@@ -698,7 +629,6 @@
           <w:b/>
           <w:color w:val="000000"/>
         </w:rPr>
-        <w:lastRenderedPageBreak/>
         <w:t>WHEREFORE</w:t>
       </w:r>
       <w:r>
@@ -1084,7 +1014,6 @@
       </w:rPr>
       <w:t>{{</w:t>
     </w:r>
-    <w:proofErr w:type="spellStart"/>
     <w:r>
       <w:rPr>
         <w:rFonts w:ascii="Bookman Old Style" w:eastAsia="Bookman Old Style" w:hAnsi="Bookman Old Style" w:cs="Bookman Old Style"/>
@@ -1094,7 +1023,6 @@
       </w:rPr>
       <w:t>client_name</w:t>
     </w:r>
-    <w:proofErr w:type="spellEnd"/>
     <w:r>
       <w:rPr>
         <w:rFonts w:ascii="Bookman Old Style" w:eastAsia="Bookman Old Style" w:hAnsi="Bookman Old Style" w:cs="Bookman Old Style"/>
@@ -1222,25 +1150,7 @@
         <w:sz w:val="20"/>
         <w:szCs w:val="20"/>
       </w:rPr>
-      <w:t>DENR-PAB Case No. NCR {{</w:t>
-    </w:r>
-    <w:proofErr w:type="spellStart"/>
-    <w:r>
-      <w:rPr>
-        <w:rFonts w:ascii="Bookman Old Style" w:eastAsia="Bookman Old Style" w:hAnsi="Bookman Old Style" w:cs="Bookman Old Style"/>
-        <w:sz w:val="20"/>
-        <w:szCs w:val="20"/>
-      </w:rPr>
-      <w:t>case_number</w:t>
-    </w:r>
-    <w:proofErr w:type="spellEnd"/>
-    <w:r>
-      <w:rPr>
-        <w:rFonts w:ascii="Bookman Old Style" w:eastAsia="Bookman Old Style" w:hAnsi="Bookman Old Style" w:cs="Bookman Old Style"/>
-        <w:sz w:val="20"/>
-        <w:szCs w:val="20"/>
-      </w:rPr>
-      <w:t>}}</w:t>
+      <w:t>DENR-PAB Case No. NCR {{case_number}}</w:t>
     </w:r>
   </w:p>
   <w:p>
@@ -1265,7 +1175,6 @@
       </w:rPr>
       <w:t>NOV-EMB-NCR-{{</w:t>
     </w:r>
-    <w:proofErr w:type="spellStart"/>
     <w:r>
       <w:rPr>
         <w:rFonts w:ascii="Bookman Old Style" w:eastAsia="Bookman Old Style" w:hAnsi="Bookman Old Style" w:cs="Bookman Old Style"/>
@@ -1290,7 +1199,6 @@
       </w:rPr>
       <w:t>_only</w:t>
     </w:r>
-    <w:proofErr w:type="spellEnd"/>
     <w:r>
       <w:rPr>
         <w:rFonts w:ascii="Bookman Old Style" w:eastAsia="Bookman Old Style" w:hAnsi="Bookman Old Style" w:cs="Bookman Old Style"/>

</xml_diff>